<commit_message>
fix: Adjust spacing in worker timesheet template for better alignment
</commit_message>
<xml_diff>
--- a/storage/app/templates/worker-timesheet.docx
+++ b/storage/app/templates/worker-timesheet.docx
@@ -29,7 +29,7 @@
                     </pic:cNvPicPr>
                   </pic:nvPicPr>
                   <pic:blipFill>
-                    <a:blip r:embed="rId6"/>
+                    <a:blip r:embed="rId7"/>
                     <a:stretch>
                       <a:fillRect/>
                     </a:stretch>
@@ -336,7 +336,7 @@
                 <w:szCs w:val="28"/>
                 <w:rtl/>
               </w:rPr>
-              <w:t xml:space="preserve">   </w:t>
+              <w:t xml:space="preserve">  </w:t>
             </w:r>
             <w:r>
               <w:rPr>
@@ -545,7 +545,7 @@
                 <w:sz w:val="28"/>
                 <w:szCs w:val="28"/>
               </w:rPr>
-              <w:t xml:space="preserve">  </w:t>
+              <w:t xml:space="preserve"> </w:t>
             </w:r>
             <w:r>
               <w:rPr>
@@ -632,9 +632,18 @@
                 <w:rtl/>
                 <w:lang w:bidi="ar-EG"/>
               </w:rPr>
-              <w:t xml:space="preserve">رقم </w:t>
-            </w:r>
-            <w:proofErr w:type="gramStart"/>
+              <w:t>رقم البطاقة</w:t>
+            </w:r>
+            <w:r>
+              <w:rPr>
+                <w:rFonts w:asciiTheme="majorHAnsi" w:eastAsia="Calibri" w:hAnsiTheme="majorHAnsi" w:cs="Arial" w:hint="cs"/>
+                <w:sz w:val="28"/>
+                <w:szCs w:val="28"/>
+                <w:rtl/>
+                <w:lang w:bidi="ar-EG"/>
+              </w:rPr>
+              <w:t xml:space="preserve"> </w:t>
+            </w:r>
             <w:r>
               <w:rPr>
                 <w:rFonts w:asciiTheme="majorHAnsi" w:eastAsia="Calibri" w:hAnsiTheme="majorHAnsi" w:cs="Arial"/>
@@ -643,46 +652,16 @@
                 <w:rtl/>
                 <w:lang w:bidi="ar-EG"/>
               </w:rPr>
-              <w:t>البطاقة</w:t>
-            </w:r>
-            <w:r>
-              <w:rPr>
-                <w:rFonts w:asciiTheme="majorHAnsi" w:eastAsia="Calibri" w:hAnsiTheme="majorHAnsi" w:cs="Arial" w:hint="cs"/>
-                <w:sz w:val="28"/>
-                <w:szCs w:val="28"/>
-                <w:rtl/>
+              <w:t xml:space="preserve"> </w:t>
+            </w:r>
+            <w:r>
+              <w:rPr>
+                <w:rFonts w:asciiTheme="majorHAnsi" w:eastAsia="Calibri" w:hAnsiTheme="majorHAnsi" w:cs="Arial"/>
+                <w:sz w:val="28"/>
+                <w:szCs w:val="28"/>
                 <w:lang w:bidi="ar-EG"/>
               </w:rPr>
-              <w:t xml:space="preserve"> </w:t>
-            </w:r>
-            <w:r>
-              <w:rPr>
-                <w:rFonts w:asciiTheme="majorHAnsi" w:eastAsia="Calibri" w:hAnsiTheme="majorHAnsi" w:cs="Arial"/>
-                <w:sz w:val="28"/>
-                <w:szCs w:val="28"/>
-                <w:rtl/>
-                <w:lang w:bidi="ar-EG"/>
-              </w:rPr>
-              <w:t xml:space="preserve"> </w:t>
-            </w:r>
-            <w:r>
-              <w:rPr>
-                <w:rFonts w:asciiTheme="majorHAnsi" w:eastAsia="Calibri" w:hAnsiTheme="majorHAnsi" w:cs="Arial"/>
-                <w:sz w:val="28"/>
-                <w:szCs w:val="28"/>
-                <w:lang w:bidi="ar-EG"/>
-              </w:rPr>
-              <w:t>ID</w:t>
-            </w:r>
-            <w:proofErr w:type="gramEnd"/>
-            <w:r>
-              <w:rPr>
-                <w:rFonts w:asciiTheme="majorHAnsi" w:eastAsia="Calibri" w:hAnsiTheme="majorHAnsi" w:cs="Arial"/>
-                <w:sz w:val="28"/>
-                <w:szCs w:val="28"/>
-                <w:lang w:bidi="ar-EG"/>
-              </w:rPr>
-              <w:t xml:space="preserve"> Number</w:t>
+              <w:t>ID Number</w:t>
             </w:r>
           </w:p>
         </w:tc>
@@ -768,7 +747,7 @@
                 <w:szCs w:val="28"/>
                 <w:rtl/>
               </w:rPr>
-              <w:t xml:space="preserve">  </w:t>
+              <w:t xml:space="preserve"> </w:t>
             </w:r>
             <w:r>
               <w:rPr>
@@ -841,20 +820,8 @@
                 <w:rtl/>
                 <w:lang w:bidi="ar-EG"/>
               </w:rPr>
-              <w:t xml:space="preserve">وقت </w:t>
-            </w:r>
-            <w:proofErr w:type="spellStart"/>
-            <w:r>
-              <w:rPr>
-                <w:rFonts w:asciiTheme="majorHAnsi" w:eastAsia="Calibri" w:hAnsiTheme="majorHAnsi" w:cs="Arial" w:hint="cs"/>
-                <w:sz w:val="28"/>
-                <w:szCs w:val="28"/>
-                <w:rtl/>
-                <w:lang w:bidi="ar-EG"/>
-              </w:rPr>
-              <w:t>الشيفت</w:t>
-            </w:r>
-            <w:proofErr w:type="spellEnd"/>
+              <w:t>وقت الشيف</w:t>
+            </w:r>
             <w:r>
               <w:rPr>
                 <w:rFonts w:asciiTheme="majorHAnsi" w:eastAsia="Calibri" w:hAnsiTheme="majorHAnsi" w:cs="Arial"/>
@@ -2334,4 +2301,16 @@
   <a:objectDefaults/>
   <a:extraClrSchemeLst/>
 </a:theme>
+</file>
+
+<file path=customXml/item1.xml><?xml version="1.0" encoding="utf-8"?>
+<b:Sources xmlns:b="http://schemas.openxmlformats.org/officeDocument/2006/bibliography" xmlns="http://schemas.openxmlformats.org/officeDocument/2006/bibliography" SelectedStyle="\APASixthEditionOfficeOnline.xsl" StyleName="APA" Version="6"/>
+</file>
+
+<file path=customXml/itemProps1.xml><?xml version="1.0" encoding="utf-8"?>
+<ds:datastoreItem xmlns:ds="http://schemas.openxmlformats.org/officeDocument/2006/customXml" ds:itemID="{05F71009-9AF0-4DA7-9D25-6D731EC7FFBA}">
+  <ds:schemaRefs>
+    <ds:schemaRef ds:uri="http://schemas.openxmlformats.org/officeDocument/2006/bibliography"/>
+  </ds:schemaRefs>
+</ds:datastoreItem>
 </file>
</xml_diff>

<commit_message>
feat: Improve document export functionality and enhance worker timesheet template
</commit_message>
<xml_diff>
--- a/storage/app/templates/worker-timesheet.docx
+++ b/storage/app/templates/worker-timesheet.docx
@@ -12,7 +12,7 @@
           <w:rtl/>
         </w:rPr>
         <w:drawing>
-          <wp:inline distT="0" distB="0" distL="0" distR="0" wp14:anchorId="1FB1CE1D" wp14:editId="033CFB1E">
+          <wp:inline distT="0" distB="0" distL="0" distR="0" wp14:anchorId="1FB1CE1D" wp14:editId="2D9DBA46">
             <wp:extent cx="5274310" cy="347980"/>
             <wp:effectExtent l="0" t="0" r="0" b="0"/>
             <wp:docPr id="36" name="Image35 Copy 1" descr="A picture containing company name  Description automatically generated"/>
@@ -336,7 +336,7 @@
                 <w:szCs w:val="28"/>
                 <w:rtl/>
               </w:rPr>
-              <w:t xml:space="preserve">  </w:t>
+              <w:t xml:space="preserve">   </w:t>
             </w:r>
             <w:r>
               <w:rPr>
@@ -545,7 +545,7 @@
                 <w:sz w:val="28"/>
                 <w:szCs w:val="28"/>
               </w:rPr>
-              <w:t xml:space="preserve"> </w:t>
+              <w:t xml:space="preserve">  </w:t>
             </w:r>
             <w:r>
               <w:rPr>
@@ -747,7 +747,7 @@
                 <w:szCs w:val="28"/>
                 <w:rtl/>
               </w:rPr>
-              <w:t xml:space="preserve"> </w:t>
+              <w:t xml:space="preserve">  </w:t>
             </w:r>
             <w:r>
               <w:rPr>
@@ -820,8 +820,20 @@
                 <w:rtl/>
                 <w:lang w:bidi="ar-EG"/>
               </w:rPr>
-              <w:t>وقت الشيف</w:t>
-            </w:r>
+              <w:t xml:space="preserve">وقت </w:t>
+            </w:r>
+            <w:proofErr w:type="spellStart"/>
+            <w:r>
+              <w:rPr>
+                <w:rFonts w:asciiTheme="majorHAnsi" w:eastAsia="Calibri" w:hAnsiTheme="majorHAnsi" w:cs="Arial" w:hint="cs"/>
+                <w:sz w:val="28"/>
+                <w:szCs w:val="28"/>
+                <w:rtl/>
+                <w:lang w:bidi="ar-EG"/>
+              </w:rPr>
+              <w:t>الشيفت</w:t>
+            </w:r>
+            <w:proofErr w:type="spellEnd"/>
             <w:r>
               <w:rPr>
                 <w:rFonts w:asciiTheme="majorHAnsi" w:eastAsia="Calibri" w:hAnsiTheme="majorHAnsi" w:cs="Arial"/>

</xml_diff>

<commit_message>
fix: Adjust spacing and correct label in worker timesheet template
</commit_message>
<xml_diff>
--- a/storage/app/templates/worker-timesheet.docx
+++ b/storage/app/templates/worker-timesheet.docx
@@ -12,9 +12,17 @@
           <w:rtl/>
         </w:rPr>
         <w:drawing>
-          <wp:inline distT="0" distB="0" distL="0" distR="0" wp14:anchorId="1FB1CE1D" wp14:editId="2D9DBA46">
+          <wp:anchor distT="0" distB="0" distL="114300" distR="114300" simplePos="0" relativeHeight="251658240" behindDoc="0" locked="0" layoutInCell="1" allowOverlap="1" wp14:anchorId="1FB1CE1D" wp14:editId="6C34D225">
+            <wp:simplePos x="0" y="0"/>
+            <wp:positionH relativeFrom="column">
+              <wp:posOffset>333375</wp:posOffset>
+            </wp:positionH>
+            <wp:positionV relativeFrom="page">
+              <wp:posOffset>571500</wp:posOffset>
+            </wp:positionV>
             <wp:extent cx="5274310" cy="347980"/>
-            <wp:effectExtent l="0" t="0" r="0" b="0"/>
+            <wp:effectExtent l="0" t="0" r="2540" b="0"/>
+            <wp:wrapTopAndBottom/>
             <wp:docPr id="36" name="Image35 Copy 1" descr="A picture containing company name  Description automatically generated"/>
             <wp:cNvGraphicFramePr>
               <a:graphicFrameLocks xmlns:a="http://schemas.openxmlformats.org/drawingml/2006/main" noChangeAspect="1"/>
@@ -29,7 +37,13 @@
                     </pic:cNvPicPr>
                   </pic:nvPicPr>
                   <pic:blipFill>
-                    <a:blip r:embed="rId7"/>
+                    <a:blip r:embed="rId7">
+                      <a:extLst>
+                        <a:ext uri="{28A0092B-C50C-407E-A947-70E740481C1C}">
+                          <a14:useLocalDpi xmlns:a14="http://schemas.microsoft.com/office/drawing/2010/main" val="0"/>
+                        </a:ext>
+                      </a:extLst>
+                    </a:blip>
                     <a:stretch>
                       <a:fillRect/>
                     </a:stretch>
@@ -46,7 +60,7 @@
                 </pic:pic>
               </a:graphicData>
             </a:graphic>
-          </wp:inline>
+          </wp:anchor>
         </w:drawing>
       </w:r>
     </w:p>
@@ -336,7 +350,7 @@
                 <w:szCs w:val="28"/>
                 <w:rtl/>
               </w:rPr>
-              <w:t xml:space="preserve">   </w:t>
+              <w:t xml:space="preserve">  </w:t>
             </w:r>
             <w:r>
               <w:rPr>
@@ -545,7 +559,7 @@
                 <w:sz w:val="28"/>
                 <w:szCs w:val="28"/>
               </w:rPr>
-              <w:t xml:space="preserve">  </w:t>
+              <w:t xml:space="preserve"> </w:t>
             </w:r>
             <w:r>
               <w:rPr>
@@ -632,7 +646,18 @@
                 <w:rtl/>
                 <w:lang w:bidi="ar-EG"/>
               </w:rPr>
-              <w:t>رقم البطاقة</w:t>
+              <w:t xml:space="preserve">رقم </w:t>
+            </w:r>
+            <w:proofErr w:type="gramStart"/>
+            <w:r>
+              <w:rPr>
+                <w:rFonts w:asciiTheme="majorHAnsi" w:eastAsia="Calibri" w:hAnsiTheme="majorHAnsi" w:cs="Arial"/>
+                <w:sz w:val="28"/>
+                <w:szCs w:val="28"/>
+                <w:rtl/>
+                <w:lang w:bidi="ar-EG"/>
+              </w:rPr>
+              <w:t>البطاقة</w:t>
             </w:r>
             <w:r>
               <w:rPr>
@@ -661,7 +686,17 @@
                 <w:szCs w:val="28"/>
                 <w:lang w:bidi="ar-EG"/>
               </w:rPr>
-              <w:t>ID Number</w:t>
+              <w:t>ID</w:t>
+            </w:r>
+            <w:proofErr w:type="gramEnd"/>
+            <w:r>
+              <w:rPr>
+                <w:rFonts w:asciiTheme="majorHAnsi" w:eastAsia="Calibri" w:hAnsiTheme="majorHAnsi" w:cs="Arial"/>
+                <w:sz w:val="28"/>
+                <w:szCs w:val="28"/>
+                <w:lang w:bidi="ar-EG"/>
+              </w:rPr>
+              <w:t xml:space="preserve"> Number</w:t>
             </w:r>
           </w:p>
         </w:tc>
@@ -747,7 +782,7 @@
                 <w:szCs w:val="28"/>
                 <w:rtl/>
               </w:rPr>
-              <w:t xml:space="preserve">  </w:t>
+              <w:t xml:space="preserve"> </w:t>
             </w:r>
             <w:r>
               <w:rPr>
@@ -820,20 +855,8 @@
                 <w:rtl/>
                 <w:lang w:bidi="ar-EG"/>
               </w:rPr>
-              <w:t xml:space="preserve">وقت </w:t>
-            </w:r>
-            <w:proofErr w:type="spellStart"/>
-            <w:r>
-              <w:rPr>
-                <w:rFonts w:asciiTheme="majorHAnsi" w:eastAsia="Calibri" w:hAnsiTheme="majorHAnsi" w:cs="Arial" w:hint="cs"/>
-                <w:sz w:val="28"/>
-                <w:szCs w:val="28"/>
-                <w:rtl/>
-                <w:lang w:bidi="ar-EG"/>
-              </w:rPr>
-              <w:t>الشيفت</w:t>
-            </w:r>
-            <w:proofErr w:type="spellEnd"/>
+              <w:t>وقت الشيف</w:t>
+            </w:r>
             <w:r>
               <w:rPr>
                 <w:rFonts w:asciiTheme="majorHAnsi" w:eastAsia="Calibri" w:hAnsiTheme="majorHAnsi" w:cs="Arial"/>

</xml_diff>

<commit_message>
fix: Correct spacing and label in worker timesheet template
</commit_message>
<xml_diff>
--- a/storage/app/templates/worker-timesheet.docx
+++ b/storage/app/templates/worker-timesheet.docx
@@ -12,17 +12,9 @@
           <w:rtl/>
         </w:rPr>
         <w:drawing>
-          <wp:anchor distT="0" distB="0" distL="114300" distR="114300" simplePos="0" relativeHeight="251658240" behindDoc="0" locked="0" layoutInCell="1" allowOverlap="1" wp14:anchorId="1FB1CE1D" wp14:editId="6C34D225">
-            <wp:simplePos x="0" y="0"/>
-            <wp:positionH relativeFrom="column">
-              <wp:posOffset>333375</wp:posOffset>
-            </wp:positionH>
-            <wp:positionV relativeFrom="page">
-              <wp:posOffset>571500</wp:posOffset>
-            </wp:positionV>
+          <wp:inline distT="0" distB="0" distL="0" distR="0" wp14:anchorId="1FB1CE1D" wp14:editId="2D9DBA46">
             <wp:extent cx="5274310" cy="347980"/>
-            <wp:effectExtent l="0" t="0" r="2540" b="0"/>
-            <wp:wrapTopAndBottom/>
+            <wp:effectExtent l="0" t="0" r="0" b="0"/>
             <wp:docPr id="36" name="Image35 Copy 1" descr="A picture containing company name  Description automatically generated"/>
             <wp:cNvGraphicFramePr>
               <a:graphicFrameLocks xmlns:a="http://schemas.openxmlformats.org/drawingml/2006/main" noChangeAspect="1"/>
@@ -37,13 +29,7 @@
                     </pic:cNvPicPr>
                   </pic:nvPicPr>
                   <pic:blipFill>
-                    <a:blip r:embed="rId7">
-                      <a:extLst>
-                        <a:ext uri="{28A0092B-C50C-407E-A947-70E740481C1C}">
-                          <a14:useLocalDpi xmlns:a14="http://schemas.microsoft.com/office/drawing/2010/main" val="0"/>
-                        </a:ext>
-                      </a:extLst>
-                    </a:blip>
+                    <a:blip r:embed="rId7"/>
                     <a:stretch>
                       <a:fillRect/>
                     </a:stretch>
@@ -60,7 +46,7 @@
                 </pic:pic>
               </a:graphicData>
             </a:graphic>
-          </wp:anchor>
+          </wp:inline>
         </w:drawing>
       </w:r>
     </w:p>
@@ -350,7 +336,7 @@
                 <w:szCs w:val="28"/>
                 <w:rtl/>
               </w:rPr>
-              <w:t xml:space="preserve">  </w:t>
+              <w:t xml:space="preserve">   </w:t>
             </w:r>
             <w:r>
               <w:rPr>
@@ -559,7 +545,7 @@
                 <w:sz w:val="28"/>
                 <w:szCs w:val="28"/>
               </w:rPr>
-              <w:t xml:space="preserve"> </w:t>
+              <w:t xml:space="preserve">  </w:t>
             </w:r>
             <w:r>
               <w:rPr>
@@ -646,9 +632,18 @@
                 <w:rtl/>
                 <w:lang w:bidi="ar-EG"/>
               </w:rPr>
-              <w:t xml:space="preserve">رقم </w:t>
-            </w:r>
-            <w:proofErr w:type="gramStart"/>
+              <w:t>رقم البطاقة</w:t>
+            </w:r>
+            <w:r>
+              <w:rPr>
+                <w:rFonts w:asciiTheme="majorHAnsi" w:eastAsia="Calibri" w:hAnsiTheme="majorHAnsi" w:cs="Arial" w:hint="cs"/>
+                <w:sz w:val="28"/>
+                <w:szCs w:val="28"/>
+                <w:rtl/>
+                <w:lang w:bidi="ar-EG"/>
+              </w:rPr>
+              <w:t xml:space="preserve"> </w:t>
+            </w:r>
             <w:r>
               <w:rPr>
                 <w:rFonts w:asciiTheme="majorHAnsi" w:eastAsia="Calibri" w:hAnsiTheme="majorHAnsi" w:cs="Arial"/>
@@ -657,46 +652,16 @@
                 <w:rtl/>
                 <w:lang w:bidi="ar-EG"/>
               </w:rPr>
-              <w:t>البطاقة</w:t>
-            </w:r>
-            <w:r>
-              <w:rPr>
-                <w:rFonts w:asciiTheme="majorHAnsi" w:eastAsia="Calibri" w:hAnsiTheme="majorHAnsi" w:cs="Arial" w:hint="cs"/>
-                <w:sz w:val="28"/>
-                <w:szCs w:val="28"/>
-                <w:rtl/>
+              <w:t xml:space="preserve"> </w:t>
+            </w:r>
+            <w:r>
+              <w:rPr>
+                <w:rFonts w:asciiTheme="majorHAnsi" w:eastAsia="Calibri" w:hAnsiTheme="majorHAnsi" w:cs="Arial"/>
+                <w:sz w:val="28"/>
+                <w:szCs w:val="28"/>
                 <w:lang w:bidi="ar-EG"/>
               </w:rPr>
-              <w:t xml:space="preserve"> </w:t>
-            </w:r>
-            <w:r>
-              <w:rPr>
-                <w:rFonts w:asciiTheme="majorHAnsi" w:eastAsia="Calibri" w:hAnsiTheme="majorHAnsi" w:cs="Arial"/>
-                <w:sz w:val="28"/>
-                <w:szCs w:val="28"/>
-                <w:rtl/>
-                <w:lang w:bidi="ar-EG"/>
-              </w:rPr>
-              <w:t xml:space="preserve"> </w:t>
-            </w:r>
-            <w:r>
-              <w:rPr>
-                <w:rFonts w:asciiTheme="majorHAnsi" w:eastAsia="Calibri" w:hAnsiTheme="majorHAnsi" w:cs="Arial"/>
-                <w:sz w:val="28"/>
-                <w:szCs w:val="28"/>
-                <w:lang w:bidi="ar-EG"/>
-              </w:rPr>
-              <w:t>ID</w:t>
-            </w:r>
-            <w:proofErr w:type="gramEnd"/>
-            <w:r>
-              <w:rPr>
-                <w:rFonts w:asciiTheme="majorHAnsi" w:eastAsia="Calibri" w:hAnsiTheme="majorHAnsi" w:cs="Arial"/>
-                <w:sz w:val="28"/>
-                <w:szCs w:val="28"/>
-                <w:lang w:bidi="ar-EG"/>
-              </w:rPr>
-              <w:t xml:space="preserve"> Number</w:t>
+              <w:t>ID Number</w:t>
             </w:r>
           </w:p>
         </w:tc>
@@ -782,7 +747,7 @@
                 <w:szCs w:val="28"/>
                 <w:rtl/>
               </w:rPr>
-              <w:t xml:space="preserve"> </w:t>
+              <w:t xml:space="preserve">  </w:t>
             </w:r>
             <w:r>
               <w:rPr>
@@ -855,8 +820,20 @@
                 <w:rtl/>
                 <w:lang w:bidi="ar-EG"/>
               </w:rPr>
-              <w:t>وقت الشيف</w:t>
-            </w:r>
+              <w:t xml:space="preserve">وقت </w:t>
+            </w:r>
+            <w:proofErr w:type="spellStart"/>
+            <w:r>
+              <w:rPr>
+                <w:rFonts w:asciiTheme="majorHAnsi" w:eastAsia="Calibri" w:hAnsiTheme="majorHAnsi" w:cs="Arial" w:hint="cs"/>
+                <w:sz w:val="28"/>
+                <w:szCs w:val="28"/>
+                <w:rtl/>
+                <w:lang w:bidi="ar-EG"/>
+              </w:rPr>
+              <w:t>الشيفت</w:t>
+            </w:r>
+            <w:proofErr w:type="spellEnd"/>
             <w:r>
               <w:rPr>
                 <w:rFonts w:asciiTheme="majorHAnsi" w:eastAsia="Calibri" w:hAnsiTheme="majorHAnsi" w:cs="Arial"/>

</xml_diff>

<commit_message>
fix: worker timesheet template problem
</commit_message>
<xml_diff>
--- a/storage/app/templates/worker-timesheet.docx
+++ b/storage/app/templates/worker-timesheet.docx
@@ -12,9 +12,9 @@
           <w:rtl/>
         </w:rPr>
         <w:drawing>
-          <wp:inline distT="0" distB="0" distL="0" distR="0" wp14:anchorId="1FB1CE1D" wp14:editId="2D9DBA46">
+          <wp:inline distT="0" distB="0" distL="0" distR="0" wp14:anchorId="0C14ABC9" wp14:editId="1117A07A">
             <wp:extent cx="5274310" cy="347980"/>
-            <wp:effectExtent l="0" t="0" r="0" b="0"/>
+            <wp:effectExtent l="0" t="0" r="2540" b="0"/>
             <wp:docPr id="36" name="Image35 Copy 1" descr="A picture containing company name  Description automatically generated"/>
             <wp:cNvGraphicFramePr>
               <a:graphicFrameLocks xmlns:a="http://schemas.openxmlformats.org/drawingml/2006/main" noChangeAspect="1"/>
@@ -29,7 +29,13 @@
                     </pic:cNvPicPr>
                   </pic:nvPicPr>
                   <pic:blipFill>
-                    <a:blip r:embed="rId7"/>
+                    <a:blip r:embed="rId5">
+                      <a:extLst>
+                        <a:ext uri="{28A0092B-C50C-407E-A947-70E740481C1C}">
+                          <a14:useLocalDpi xmlns:a14="http://schemas.microsoft.com/office/drawing/2010/main" val="0"/>
+                        </a:ext>
+                      </a:extLst>
+                    </a:blip>
                     <a:stretch>
                       <a:fillRect/>
                     </a:stretch>
@@ -60,9 +66,9 @@
         <w:tblLook w:val="04A0" w:firstRow="1" w:lastRow="0" w:firstColumn="1" w:lastColumn="0" w:noHBand="0" w:noVBand="1"/>
       </w:tblPr>
       <w:tblGrid>
-        <w:gridCol w:w="3374"/>
-        <w:gridCol w:w="2934"/>
-        <w:gridCol w:w="2827"/>
+        <w:gridCol w:w="3375"/>
+        <w:gridCol w:w="2551"/>
+        <w:gridCol w:w="3209"/>
         <w:gridCol w:w="2655"/>
       </w:tblGrid>
       <w:tr>
@@ -71,7 +77,7 @@
         </w:trPr>
         <w:tc>
           <w:tcPr>
-            <w:tcW w:w="3374" w:type="dxa"/>
+            <w:tcW w:w="3375" w:type="dxa"/>
             <w:shd w:val="clear" w:color="auto" w:fill="B8CCE4" w:themeFill="accent1" w:themeFillTint="66"/>
           </w:tcPr>
           <w:p>
@@ -82,25 +88,14 @@
                 <w:szCs w:val="28"/>
               </w:rPr>
             </w:pPr>
-            <w:proofErr w:type="spellStart"/>
-            <w:r>
-              <w:rPr>
-                <w:rFonts w:asciiTheme="majorHAnsi" w:eastAsia="Calibri" w:hAnsiTheme="majorHAnsi"/>
-                <w:sz w:val="28"/>
-                <w:szCs w:val="28"/>
-                <w:rtl/>
-              </w:rPr>
-              <w:t>إسم</w:t>
-            </w:r>
-            <w:proofErr w:type="spellEnd"/>
-            <w:r>
-              <w:rPr>
-                <w:rFonts w:asciiTheme="majorHAnsi" w:eastAsia="Calibri" w:hAnsiTheme="majorHAnsi"/>
-                <w:sz w:val="28"/>
-                <w:szCs w:val="28"/>
-                <w:rtl/>
-              </w:rPr>
-              <w:t xml:space="preserve"> المشروع </w:t>
+            <w:r>
+              <w:rPr>
+                <w:rFonts w:asciiTheme="majorHAnsi" w:eastAsia="Calibri" w:hAnsiTheme="majorHAnsi"/>
+                <w:sz w:val="28"/>
+                <w:szCs w:val="28"/>
+                <w:rtl/>
+              </w:rPr>
+              <w:t xml:space="preserve">إسم المشروع </w:t>
             </w:r>
             <w:r>
               <w:rPr>
@@ -123,9 +118,96 @@
         </w:tc>
         <w:tc>
           <w:tcPr>
-            <w:tcW w:w="8416" w:type="dxa"/>
+            <w:tcW w:w="8415" w:type="dxa"/>
             <w:gridSpan w:val="3"/>
           </w:tcPr>
+          <w:p>
+            <w:pPr>
+              <w:jc w:val="center"/>
+              <w:rPr>
+                <w:rFonts w:asciiTheme="majorHAnsi" w:eastAsia="Calibri" w:hAnsiTheme="majorHAnsi"/>
+                <w:b/>
+                <w:bCs/>
+                <w:sz w:val="32"/>
+                <w:szCs w:val="32"/>
+              </w:rPr>
+            </w:pPr>
+            <w:r>
+              <w:rPr>
+                <w:rFonts w:asciiTheme="majorHAnsi" w:eastAsia="Calibri" w:hAnsiTheme="majorHAnsi"/>
+                <w:b/>
+                <w:bCs/>
+                <w:sz w:val="32"/>
+                <w:szCs w:val="32"/>
+                <w:rtl/>
+              </w:rPr>
+              <w:t>محطة كهرباء أبيدوس</w:t>
+            </w:r>
+            <w:r>
+              <w:rPr>
+                <w:rFonts w:asciiTheme="majorHAnsi" w:eastAsia="Calibri" w:hAnsiTheme="majorHAnsi" w:cs="Arial"/>
+                <w:b/>
+                <w:bCs/>
+                <w:sz w:val="32"/>
+                <w:szCs w:val="32"/>
+              </w:rPr>
+              <w:t>2</w:t>
+            </w:r>
+            <w:r>
+              <w:rPr>
+                <w:rFonts w:asciiTheme="majorHAnsi" w:eastAsia="Calibri" w:hAnsiTheme="majorHAnsi" w:cs="Arial"/>
+                <w:b/>
+                <w:bCs/>
+                <w:sz w:val="32"/>
+                <w:szCs w:val="32"/>
+                <w:rtl/>
+              </w:rPr>
+              <w:t xml:space="preserve"> </w:t>
+            </w:r>
+            <w:r>
+              <w:rPr>
+                <w:rFonts w:asciiTheme="majorHAnsi" w:eastAsia="Calibri" w:hAnsiTheme="majorHAnsi"/>
+                <w:b/>
+                <w:bCs/>
+                <w:sz w:val="32"/>
+                <w:szCs w:val="32"/>
+                <w:rtl/>
+              </w:rPr>
+              <w:t xml:space="preserve">للطاقة الشمسية بقدرة </w:t>
+            </w:r>
+            <w:r>
+              <w:rPr>
+                <w:rFonts w:asciiTheme="majorHAnsi" w:eastAsia="Calibri" w:hAnsiTheme="majorHAnsi" w:cs="Arial"/>
+                <w:b/>
+                <w:bCs/>
+                <w:sz w:val="32"/>
+                <w:szCs w:val="32"/>
+              </w:rPr>
+              <w:t>1000</w:t>
+            </w:r>
+            <w:r>
+              <w:rPr>
+                <w:rFonts w:asciiTheme="majorHAnsi" w:eastAsia="Calibri" w:hAnsiTheme="majorHAnsi" w:cs="Arial"/>
+                <w:b/>
+                <w:bCs/>
+                <w:sz w:val="32"/>
+                <w:szCs w:val="32"/>
+                <w:rtl/>
+              </w:rPr>
+              <w:t xml:space="preserve"> </w:t>
+            </w:r>
+            <w:r>
+              <w:rPr>
+                <w:rFonts w:asciiTheme="majorHAnsi" w:eastAsia="Calibri" w:hAnsiTheme="majorHAnsi"/>
+                <w:b/>
+                <w:bCs/>
+                <w:sz w:val="32"/>
+                <w:szCs w:val="32"/>
+                <w:rtl/>
+              </w:rPr>
+              <w:t xml:space="preserve">ميجاوات </w:t>
+            </w:r>
+          </w:p>
           <w:p>
             <w:pPr>
               <w:jc w:val="center"/>
@@ -143,34 +225,11 @@
                 <w:rFonts w:asciiTheme="majorHAnsi" w:eastAsia="Calibri" w:hAnsiTheme="majorHAnsi" w:cs="Arial"/>
                 <w:b/>
                 <w:bCs/>
-                <w:sz w:val="28"/>
-                <w:szCs w:val="28"/>
-                <w:rtl/>
-              </w:rPr>
-              <w:t>${</w:t>
-            </w:r>
-            <w:proofErr w:type="spellStart"/>
-            <w:r>
-              <w:rPr>
-                <w:rFonts w:asciiTheme="majorHAnsi" w:eastAsia="Calibri" w:hAnsiTheme="majorHAnsi"/>
-                <w:b/>
-                <w:bCs/>
-                <w:sz w:val="28"/>
-                <w:szCs w:val="28"/>
-              </w:rPr>
-              <w:t>project_name_en</w:t>
-            </w:r>
-            <w:proofErr w:type="spellEnd"/>
-            <w:r>
-              <w:rPr>
-                <w:rFonts w:asciiTheme="majorHAnsi" w:eastAsia="Calibri" w:hAnsiTheme="majorHAnsi" w:cs="Arial"/>
-                <w:b/>
-                <w:bCs/>
-                <w:sz w:val="28"/>
-                <w:szCs w:val="28"/>
-                <w:rtl/>
-              </w:rPr>
-              <w:t>}</w:t>
+                <w:sz w:val="32"/>
+                <w:szCs w:val="32"/>
+                <w:lang w:bidi="ar-EG"/>
+              </w:rPr>
+              <w:t>PV Power Plant Abydos 2 Solar (MW1000)</w:t>
             </w:r>
           </w:p>
         </w:tc>
@@ -181,7 +240,7 @@
         </w:trPr>
         <w:tc>
           <w:tcPr>
-            <w:tcW w:w="3374" w:type="dxa"/>
+            <w:tcW w:w="3375" w:type="dxa"/>
             <w:shd w:val="clear" w:color="auto" w:fill="B8CCE4" w:themeFill="accent1" w:themeFillTint="66"/>
           </w:tcPr>
           <w:p>
@@ -192,25 +251,14 @@
                 <w:szCs w:val="28"/>
               </w:rPr>
             </w:pPr>
-            <w:proofErr w:type="spellStart"/>
-            <w:r>
-              <w:rPr>
-                <w:rFonts w:asciiTheme="majorHAnsi" w:eastAsia="Calibri" w:hAnsiTheme="majorHAnsi"/>
-                <w:sz w:val="28"/>
-                <w:szCs w:val="28"/>
-                <w:rtl/>
-              </w:rPr>
-              <w:t>إسم</w:t>
-            </w:r>
-            <w:proofErr w:type="spellEnd"/>
-            <w:r>
-              <w:rPr>
-                <w:rFonts w:asciiTheme="majorHAnsi" w:eastAsia="Calibri" w:hAnsiTheme="majorHAnsi"/>
-                <w:sz w:val="28"/>
-                <w:szCs w:val="28"/>
-                <w:rtl/>
-              </w:rPr>
-              <w:t xml:space="preserve"> الشركة </w:t>
+            <w:r>
+              <w:rPr>
+                <w:rFonts w:asciiTheme="majorHAnsi" w:eastAsia="Calibri" w:hAnsiTheme="majorHAnsi"/>
+                <w:sz w:val="28"/>
+                <w:szCs w:val="28"/>
+                <w:rtl/>
+              </w:rPr>
+              <w:t xml:space="preserve">إسم الشركة </w:t>
             </w:r>
             <w:r>
               <w:rPr>
@@ -233,7 +281,7 @@
         </w:tc>
         <w:tc>
           <w:tcPr>
-            <w:tcW w:w="8416" w:type="dxa"/>
+            <w:tcW w:w="8415" w:type="dxa"/>
             <w:gridSpan w:val="3"/>
           </w:tcPr>
           <w:p>
@@ -252,32 +300,55 @@
                 <w:rFonts w:asciiTheme="majorHAnsi" w:eastAsia="Calibri" w:hAnsiTheme="majorHAnsi"/>
                 <w:b/>
                 <w:bCs/>
-                <w:sz w:val="28"/>
-                <w:szCs w:val="28"/>
-              </w:rPr>
-              <w:t>${</w:t>
-            </w:r>
-            <w:proofErr w:type="spellStart"/>
-            <w:r>
-              <w:rPr>
-                <w:rFonts w:asciiTheme="majorHAnsi" w:eastAsia="Calibri" w:hAnsiTheme="majorHAnsi"/>
-                <w:b/>
-                <w:bCs/>
-                <w:sz w:val="28"/>
-                <w:szCs w:val="28"/>
-              </w:rPr>
-              <w:t>company_name</w:t>
-            </w:r>
-            <w:proofErr w:type="spellEnd"/>
-            <w:r>
-              <w:rPr>
-                <w:rFonts w:asciiTheme="majorHAnsi" w:eastAsia="Calibri" w:hAnsiTheme="majorHAnsi"/>
-                <w:b/>
-                <w:bCs/>
-                <w:sz w:val="28"/>
-                <w:szCs w:val="28"/>
-              </w:rPr>
-              <w:t>}</w:t>
+                <w:sz w:val="32"/>
+                <w:szCs w:val="32"/>
+                <w:rtl/>
+              </w:rPr>
+              <w:t>تحالف الشيماء الزراعية للمقاولات والتوريدات</w:t>
+            </w:r>
+            <w:r>
+              <w:rPr>
+                <w:rFonts w:asciiTheme="majorHAnsi" w:eastAsia="Calibri" w:hAnsiTheme="majorHAnsi" w:cs="Arial"/>
+                <w:b/>
+                <w:bCs/>
+                <w:sz w:val="32"/>
+                <w:szCs w:val="32"/>
+                <w:rtl/>
+              </w:rPr>
+              <w:t>+</w:t>
+            </w:r>
+            <w:r>
+              <w:rPr>
+                <w:rFonts w:asciiTheme="majorHAnsi" w:eastAsia="Calibri" w:hAnsiTheme="majorHAnsi" w:cs="Arial"/>
+                <w:b/>
+                <w:bCs/>
+                <w:sz w:val="32"/>
+                <w:szCs w:val="32"/>
+                <w:lang w:bidi="ar-EG"/>
+              </w:rPr>
+              <w:t>FM</w:t>
+            </w:r>
+            <w:r>
+              <w:rPr>
+                <w:rFonts w:asciiTheme="majorHAnsi" w:eastAsia="Calibri" w:hAnsiTheme="majorHAnsi" w:cs="Arial"/>
+                <w:b/>
+                <w:bCs/>
+                <w:sz w:val="32"/>
+                <w:szCs w:val="32"/>
+                <w:rtl/>
+              </w:rPr>
+              <w:t xml:space="preserve"> </w:t>
+            </w:r>
+            <w:r>
+              <w:rPr>
+                <w:rFonts w:asciiTheme="majorHAnsi" w:eastAsia="Calibri" w:hAnsiTheme="majorHAnsi"/>
+                <w:b/>
+                <w:bCs/>
+                <w:sz w:val="32"/>
+                <w:szCs w:val="32"/>
+                <w:rtl/>
+              </w:rPr>
+              <w:t>للمقاولات</w:t>
             </w:r>
           </w:p>
         </w:tc>
@@ -289,7 +360,7 @@
         </w:trPr>
         <w:tc>
           <w:tcPr>
-            <w:tcW w:w="3374" w:type="dxa"/>
+            <w:tcW w:w="3375" w:type="dxa"/>
             <w:shd w:val="clear" w:color="auto" w:fill="B8CCE4" w:themeFill="accent1" w:themeFillTint="66"/>
           </w:tcPr>
           <w:p>
@@ -300,25 +371,14 @@
                 <w:szCs w:val="28"/>
               </w:rPr>
             </w:pPr>
-            <w:proofErr w:type="spellStart"/>
-            <w:r>
-              <w:rPr>
-                <w:rFonts w:asciiTheme="majorHAnsi" w:eastAsia="Calibri" w:hAnsiTheme="majorHAnsi"/>
-                <w:sz w:val="28"/>
-                <w:szCs w:val="28"/>
-                <w:rtl/>
-              </w:rPr>
-              <w:t>إسم</w:t>
-            </w:r>
-            <w:proofErr w:type="spellEnd"/>
-            <w:r>
-              <w:rPr>
-                <w:rFonts w:asciiTheme="majorHAnsi" w:eastAsia="Calibri" w:hAnsiTheme="majorHAnsi"/>
-                <w:sz w:val="28"/>
-                <w:szCs w:val="28"/>
-                <w:rtl/>
-              </w:rPr>
-              <w:t xml:space="preserve"> العامل</w:t>
+            <w:r>
+              <w:rPr>
+                <w:rFonts w:asciiTheme="majorHAnsi" w:eastAsia="Calibri" w:hAnsiTheme="majorHAnsi"/>
+                <w:sz w:val="28"/>
+                <w:szCs w:val="28"/>
+                <w:rtl/>
+              </w:rPr>
+              <w:t>إسم العامل</w:t>
             </w:r>
             <w:r>
               <w:rPr>
@@ -350,7 +410,7 @@
         </w:tc>
         <w:tc>
           <w:tcPr>
-            <w:tcW w:w="2934" w:type="dxa"/>
+            <w:tcW w:w="2551" w:type="dxa"/>
           </w:tcPr>
           <w:p>
             <w:pPr>
@@ -374,124 +434,88 @@
                 <w:szCs w:val="24"/>
                 <w:lang w:bidi="ar-EG"/>
               </w:rPr>
-              <w:t>${</w:t>
-            </w:r>
-            <w:proofErr w:type="spellStart"/>
-            <w:r>
-              <w:rPr>
-                <w:rFonts w:asciiTheme="majorHAnsi" w:eastAsia="Calibri" w:hAnsiTheme="majorHAnsi"/>
-                <w:b/>
-                <w:bCs/>
-                <w:sz w:val="24"/>
-                <w:szCs w:val="24"/>
+              <w:t>${worker_name}</w:t>
+            </w:r>
+          </w:p>
+        </w:tc>
+        <w:tc>
+          <w:tcPr>
+            <w:tcW w:w="3209" w:type="dxa"/>
+            <w:shd w:val="clear" w:color="auto" w:fill="B8CCE4" w:themeFill="accent1" w:themeFillTint="66"/>
+          </w:tcPr>
+          <w:p>
+            <w:pPr>
+              <w:rPr>
+                <w:rFonts w:asciiTheme="majorHAnsi" w:hAnsiTheme="majorHAnsi"/>
+                <w:sz w:val="28"/>
+                <w:szCs w:val="28"/>
                 <w:lang w:bidi="ar-EG"/>
               </w:rPr>
-              <w:t>worker_name</w:t>
-            </w:r>
-            <w:proofErr w:type="spellEnd"/>
-            <w:r>
-              <w:rPr>
-                <w:rFonts w:asciiTheme="majorHAnsi" w:eastAsia="Calibri" w:hAnsiTheme="majorHAnsi"/>
-                <w:b/>
-                <w:bCs/>
-                <w:sz w:val="24"/>
-                <w:szCs w:val="24"/>
+            </w:pPr>
+            <w:r>
+              <w:rPr>
+                <w:rFonts w:asciiTheme="majorHAnsi" w:eastAsia="Calibri" w:hAnsiTheme="majorHAnsi" w:hint="cs"/>
+                <w:sz w:val="28"/>
+                <w:szCs w:val="28"/>
+                <w:rtl/>
+              </w:rPr>
+              <w:t>موبايل</w:t>
+            </w:r>
+            <w:r>
+              <w:rPr>
+                <w:rFonts w:asciiTheme="majorHAnsi" w:eastAsia="Calibri" w:hAnsiTheme="majorHAnsi" w:hint="cs"/>
+                <w:sz w:val="28"/>
+                <w:szCs w:val="28"/>
+                <w:rtl/>
+              </w:rPr>
+              <w:t xml:space="preserve">      </w:t>
+            </w:r>
+            <w:r>
+              <w:rPr>
+                <w:rFonts w:asciiTheme="majorHAnsi" w:eastAsia="Calibri" w:hAnsiTheme="majorHAnsi"/>
+                <w:sz w:val="28"/>
+                <w:szCs w:val="28"/>
+                <w:rtl/>
+              </w:rPr>
+              <w:t xml:space="preserve"> </w:t>
+            </w:r>
+            <w:r>
+              <w:rPr>
+                <w:rFonts w:asciiTheme="majorHAnsi" w:eastAsia="Calibri" w:hAnsiTheme="majorHAnsi" w:cs="Arial"/>
+                <w:sz w:val="28"/>
+                <w:szCs w:val="28"/>
                 <w:lang w:bidi="ar-EG"/>
               </w:rPr>
-              <w:t>}</w:t>
-            </w:r>
-          </w:p>
-        </w:tc>
-        <w:tc>
-          <w:tcPr>
-            <w:tcW w:w="2827" w:type="dxa"/>
-            <w:shd w:val="clear" w:color="auto" w:fill="B8CCE4" w:themeFill="accent1" w:themeFillTint="66"/>
-          </w:tcPr>
-          <w:p>
-            <w:pPr>
-              <w:rPr>
-                <w:rFonts w:asciiTheme="majorHAnsi" w:hAnsiTheme="majorHAnsi"/>
-                <w:sz w:val="28"/>
-                <w:szCs w:val="28"/>
+              <w:t>Mobile Number</w:t>
+            </w:r>
+          </w:p>
+        </w:tc>
+        <w:tc>
+          <w:tcPr>
+            <w:tcW w:w="2655" w:type="dxa"/>
+          </w:tcPr>
+          <w:p>
+            <w:pPr>
+              <w:jc w:val="center"/>
+              <w:rPr>
+                <w:rFonts w:asciiTheme="majorHAnsi" w:hAnsiTheme="majorHAnsi" w:hint="cs"/>
+                <w:b/>
+                <w:bCs/>
+                <w:sz w:val="28"/>
+                <w:szCs w:val="28"/>
+                <w:rtl/>
                 <w:lang w:bidi="ar-EG"/>
               </w:rPr>
             </w:pPr>
             <w:r>
               <w:rPr>
-                <w:rFonts w:asciiTheme="majorHAnsi" w:eastAsia="Calibri" w:hAnsiTheme="majorHAnsi" w:hint="cs"/>
-                <w:sz w:val="28"/>
-                <w:szCs w:val="28"/>
-                <w:rtl/>
-              </w:rPr>
-              <w:t>موبايل</w:t>
-            </w:r>
-            <w:r>
-              <w:rPr>
-                <w:rFonts w:asciiTheme="majorHAnsi" w:eastAsia="Calibri" w:hAnsiTheme="majorHAnsi" w:hint="cs"/>
-                <w:sz w:val="28"/>
-                <w:szCs w:val="28"/>
-                <w:rtl/>
-              </w:rPr>
-              <w:t xml:space="preserve"> </w:t>
-            </w:r>
-            <w:r>
-              <w:rPr>
                 <w:rFonts w:asciiTheme="majorHAnsi" w:eastAsia="Calibri" w:hAnsiTheme="majorHAnsi" w:cs="Arial"/>
-                <w:sz w:val="28"/>
-                <w:szCs w:val="28"/>
-                <w:lang w:bidi="ar-EG"/>
-              </w:rPr>
-              <w:t>Mobile Number</w:t>
-            </w:r>
-          </w:p>
-        </w:tc>
-        <w:tc>
-          <w:tcPr>
-            <w:tcW w:w="2655" w:type="dxa"/>
-          </w:tcPr>
-          <w:p>
-            <w:pPr>
-              <w:jc w:val="center"/>
-              <w:rPr>
-                <w:rFonts w:asciiTheme="majorHAnsi" w:hAnsiTheme="majorHAnsi"/>
-                <w:b/>
-                <w:bCs/>
-                <w:sz w:val="28"/>
-                <w:szCs w:val="28"/>
-                <w:lang w:bidi="ar-EG"/>
-              </w:rPr>
-            </w:pPr>
-            <w:r>
-              <w:rPr>
-                <w:rFonts w:asciiTheme="majorHAnsi" w:eastAsia="Calibri" w:hAnsiTheme="majorHAnsi" w:cs="Arial"/>
-                <w:b/>
-                <w:bCs/>
-                <w:sz w:val="28"/>
-                <w:szCs w:val="28"/>
-              </w:rPr>
-              <w:t>${</w:t>
-            </w:r>
-            <w:proofErr w:type="spellStart"/>
-            <w:r>
-              <w:rPr>
-                <w:rFonts w:asciiTheme="majorHAnsi" w:eastAsia="Calibri" w:hAnsiTheme="majorHAnsi" w:cs="Arial"/>
-                <w:b/>
-                <w:bCs/>
-                <w:sz w:val="28"/>
-                <w:szCs w:val="28"/>
-              </w:rPr>
-              <w:t>worker_phone</w:t>
-            </w:r>
-            <w:proofErr w:type="spellEnd"/>
-            <w:r>
-              <w:rPr>
-                <w:rFonts w:asciiTheme="majorHAnsi" w:eastAsia="Calibri" w:hAnsiTheme="majorHAnsi" w:cs="Arial"/>
-                <w:b/>
-                <w:bCs/>
-                <w:sz w:val="28"/>
-                <w:szCs w:val="28"/>
-              </w:rPr>
-              <w:t>}</w:t>
+                <w:b/>
+                <w:bCs/>
+                <w:sz w:val="28"/>
+                <w:szCs w:val="28"/>
+              </w:rPr>
+              <w:t>${worker_phone}</w:t>
             </w:r>
           </w:p>
         </w:tc>
@@ -502,7 +526,7 @@
         </w:trPr>
         <w:tc>
           <w:tcPr>
-            <w:tcW w:w="3374" w:type="dxa"/>
+            <w:tcW w:w="3375" w:type="dxa"/>
             <w:shd w:val="clear" w:color="auto" w:fill="B8CCE4" w:themeFill="accent1" w:themeFillTint="66"/>
           </w:tcPr>
           <w:p>
@@ -559,7 +583,7 @@
         </w:tc>
         <w:tc>
           <w:tcPr>
-            <w:tcW w:w="2934" w:type="dxa"/>
+            <w:tcW w:w="2551" w:type="dxa"/>
           </w:tcPr>
           <w:p>
             <w:pPr>
@@ -582,134 +606,88 @@
                 <w:szCs w:val="26"/>
                 <w:lang w:bidi="ar-EG"/>
               </w:rPr>
-              <w:t>${</w:t>
-            </w:r>
-            <w:proofErr w:type="spellStart"/>
-            <w:r>
-              <w:rPr>
-                <w:rFonts w:asciiTheme="majorHAnsi" w:eastAsia="Calibri" w:hAnsiTheme="majorHAnsi"/>
-                <w:b/>
-                <w:bCs/>
-                <w:sz w:val="26"/>
-                <w:szCs w:val="26"/>
+              <w:t>${worker_job}</w:t>
+            </w:r>
+          </w:p>
+        </w:tc>
+        <w:tc>
+          <w:tcPr>
+            <w:tcW w:w="3209" w:type="dxa"/>
+            <w:shd w:val="clear" w:color="auto" w:fill="B8CCE4" w:themeFill="accent1" w:themeFillTint="66"/>
+          </w:tcPr>
+          <w:p>
+            <w:pPr>
+              <w:rPr>
+                <w:rFonts w:asciiTheme="majorHAnsi" w:eastAsia="Calibri" w:hAnsiTheme="majorHAnsi" w:cs="Arial"/>
+                <w:sz w:val="28"/>
+                <w:szCs w:val="28"/>
                 <w:lang w:bidi="ar-EG"/>
               </w:rPr>
-              <w:t>worker_job</w:t>
-            </w:r>
-            <w:proofErr w:type="spellEnd"/>
-            <w:r>
-              <w:rPr>
-                <w:rFonts w:asciiTheme="majorHAnsi" w:eastAsia="Calibri" w:hAnsiTheme="majorHAnsi"/>
-                <w:b/>
-                <w:bCs/>
-                <w:sz w:val="26"/>
-                <w:szCs w:val="26"/>
+            </w:pPr>
+            <w:r>
+              <w:rPr>
+                <w:rFonts w:asciiTheme="majorHAnsi" w:eastAsia="Calibri" w:hAnsiTheme="majorHAnsi" w:cs="Arial"/>
+                <w:sz w:val="28"/>
+                <w:szCs w:val="28"/>
+                <w:rtl/>
                 <w:lang w:bidi="ar-EG"/>
               </w:rPr>
-              <w:t>}</w:t>
-            </w:r>
-          </w:p>
-        </w:tc>
-        <w:tc>
-          <w:tcPr>
-            <w:tcW w:w="2827" w:type="dxa"/>
-            <w:shd w:val="clear" w:color="auto" w:fill="B8CCE4" w:themeFill="accent1" w:themeFillTint="66"/>
-          </w:tcPr>
-          <w:p>
-            <w:pPr>
+              <w:t>رقم البطاقة</w:t>
+            </w:r>
+            <w:r>
+              <w:rPr>
+                <w:rFonts w:asciiTheme="majorHAnsi" w:eastAsia="Calibri" w:hAnsiTheme="majorHAnsi" w:cs="Arial" w:hint="cs"/>
+                <w:sz w:val="28"/>
+                <w:szCs w:val="28"/>
+                <w:rtl/>
+                <w:lang w:bidi="ar-EG"/>
+              </w:rPr>
+              <w:t xml:space="preserve">   </w:t>
+            </w:r>
+            <w:r>
               <w:rPr>
                 <w:rFonts w:asciiTheme="majorHAnsi" w:eastAsia="Calibri" w:hAnsiTheme="majorHAnsi" w:cs="Arial"/>
                 <w:sz w:val="28"/>
                 <w:szCs w:val="28"/>
+                <w:rtl/>
                 <w:lang w:bidi="ar-EG"/>
               </w:rPr>
-            </w:pPr>
+              <w:t xml:space="preserve"> </w:t>
+            </w:r>
             <w:r>
               <w:rPr>
                 <w:rFonts w:asciiTheme="majorHAnsi" w:eastAsia="Calibri" w:hAnsiTheme="majorHAnsi" w:cs="Arial"/>
                 <w:sz w:val="28"/>
                 <w:szCs w:val="28"/>
-                <w:rtl/>
                 <w:lang w:bidi="ar-EG"/>
               </w:rPr>
-              <w:t>رقم البطاقة</w:t>
-            </w:r>
-            <w:r>
-              <w:rPr>
-                <w:rFonts w:asciiTheme="majorHAnsi" w:eastAsia="Calibri" w:hAnsiTheme="majorHAnsi" w:cs="Arial" w:hint="cs"/>
-                <w:sz w:val="28"/>
-                <w:szCs w:val="28"/>
-                <w:rtl/>
-                <w:lang w:bidi="ar-EG"/>
-              </w:rPr>
-              <w:t xml:space="preserve"> </w:t>
-            </w:r>
+              <w:t>ID Number</w:t>
+            </w:r>
+          </w:p>
+        </w:tc>
+        <w:tc>
+          <w:tcPr>
+            <w:tcW w:w="2655" w:type="dxa"/>
+          </w:tcPr>
+          <w:p>
+            <w:pPr>
+              <w:jc w:val="center"/>
+              <w:rPr>
+                <w:rFonts w:ascii="Arial" w:hAnsi="Arial"/>
+                <w:b/>
+                <w:bCs/>
+                <w:color w:val="000000"/>
+              </w:rPr>
+            </w:pPr>
             <w:r>
               <w:rPr>
                 <w:rFonts w:asciiTheme="majorHAnsi" w:eastAsia="Calibri" w:hAnsiTheme="majorHAnsi" w:cs="Arial"/>
-                <w:sz w:val="28"/>
-                <w:szCs w:val="28"/>
-                <w:rtl/>
-                <w:lang w:bidi="ar-EG"/>
-              </w:rPr>
-              <w:t xml:space="preserve"> </w:t>
-            </w:r>
-            <w:r>
-              <w:rPr>
-                <w:rFonts w:asciiTheme="majorHAnsi" w:eastAsia="Calibri" w:hAnsiTheme="majorHAnsi" w:cs="Arial"/>
-                <w:sz w:val="28"/>
-                <w:szCs w:val="28"/>
-                <w:lang w:bidi="ar-EG"/>
-              </w:rPr>
-              <w:t>ID Number</w:t>
-            </w:r>
-          </w:p>
-        </w:tc>
-        <w:tc>
-          <w:tcPr>
-            <w:tcW w:w="2655" w:type="dxa"/>
-          </w:tcPr>
-          <w:p>
-            <w:pPr>
-              <w:jc w:val="center"/>
-              <w:rPr>
-                <w:rFonts w:ascii="Arial" w:hAnsi="Arial"/>
-                <w:b/>
-                <w:bCs/>
-                <w:color w:val="000000"/>
-              </w:rPr>
-            </w:pPr>
-            <w:r>
-              <w:rPr>
-                <w:rFonts w:asciiTheme="majorHAnsi" w:eastAsia="Calibri" w:hAnsiTheme="majorHAnsi" w:cs="Arial"/>
-                <w:b/>
-                <w:bCs/>
-                <w:sz w:val="28"/>
-                <w:szCs w:val="28"/>
-              </w:rPr>
-              <w:t>${</w:t>
-            </w:r>
-            <w:proofErr w:type="spellStart"/>
-            <w:r>
-              <w:rPr>
-                <w:rFonts w:asciiTheme="majorHAnsi" w:eastAsia="Calibri" w:hAnsiTheme="majorHAnsi" w:cs="Arial"/>
-                <w:b/>
-                <w:bCs/>
-                <w:sz w:val="28"/>
-                <w:szCs w:val="28"/>
-              </w:rPr>
-              <w:t>worker_id</w:t>
-            </w:r>
-            <w:proofErr w:type="spellEnd"/>
-            <w:r>
-              <w:rPr>
-                <w:rFonts w:asciiTheme="majorHAnsi" w:eastAsia="Calibri" w:hAnsiTheme="majorHAnsi" w:cs="Arial"/>
-                <w:b/>
-                <w:bCs/>
-                <w:sz w:val="28"/>
-                <w:szCs w:val="28"/>
-              </w:rPr>
-              <w:t>}</w:t>
+                <w:b/>
+                <w:bCs/>
+                <w:sz w:val="28"/>
+                <w:szCs w:val="28"/>
+              </w:rPr>
+              <w:t>${worker_id}</w:t>
             </w:r>
           </w:p>
         </w:tc>
@@ -720,7 +698,7 @@
         </w:trPr>
         <w:tc>
           <w:tcPr>
-            <w:tcW w:w="3374" w:type="dxa"/>
+            <w:tcW w:w="3375" w:type="dxa"/>
             <w:shd w:val="clear" w:color="auto" w:fill="B8CCE4" w:themeFill="accent1" w:themeFillTint="66"/>
           </w:tcPr>
           <w:p>
@@ -786,7 +764,8 @@
         </w:tc>
         <w:tc>
           <w:tcPr>
-            <w:tcW w:w="2934" w:type="dxa"/>
+            <w:tcW w:w="8415" w:type="dxa"/>
+            <w:gridSpan w:val="3"/>
           </w:tcPr>
           <w:p>
             <w:pPr>
@@ -796,96 +775,6 @@
                 <w:szCs w:val="32"/>
               </w:rPr>
             </w:pPr>
-          </w:p>
-        </w:tc>
-        <w:tc>
-          <w:tcPr>
-            <w:tcW w:w="2827" w:type="dxa"/>
-            <w:shd w:val="clear" w:color="auto" w:fill="B8CCE4" w:themeFill="accent1" w:themeFillTint="66"/>
-          </w:tcPr>
-          <w:p>
-            <w:pPr>
-              <w:rPr>
-                <w:rFonts w:asciiTheme="majorHAnsi" w:eastAsia="Calibri" w:hAnsiTheme="majorHAnsi" w:cs="Arial"/>
-                <w:sz w:val="28"/>
-                <w:szCs w:val="28"/>
-                <w:lang w:bidi="ar-EG"/>
-              </w:rPr>
-            </w:pPr>
-            <w:r>
-              <w:rPr>
-                <w:rFonts w:asciiTheme="majorHAnsi" w:eastAsia="Calibri" w:hAnsiTheme="majorHAnsi" w:cs="Arial" w:hint="cs"/>
-                <w:sz w:val="28"/>
-                <w:szCs w:val="28"/>
-                <w:rtl/>
-                <w:lang w:bidi="ar-EG"/>
-              </w:rPr>
-              <w:t xml:space="preserve">وقت </w:t>
-            </w:r>
-            <w:proofErr w:type="spellStart"/>
-            <w:r>
-              <w:rPr>
-                <w:rFonts w:asciiTheme="majorHAnsi" w:eastAsia="Calibri" w:hAnsiTheme="majorHAnsi" w:cs="Arial" w:hint="cs"/>
-                <w:sz w:val="28"/>
-                <w:szCs w:val="28"/>
-                <w:rtl/>
-                <w:lang w:bidi="ar-EG"/>
-              </w:rPr>
-              <w:t>الشيفت</w:t>
-            </w:r>
-            <w:proofErr w:type="spellEnd"/>
-            <w:r>
-              <w:rPr>
-                <w:rFonts w:asciiTheme="majorHAnsi" w:eastAsia="Calibri" w:hAnsiTheme="majorHAnsi" w:cs="Arial"/>
-                <w:sz w:val="28"/>
-                <w:szCs w:val="28"/>
-                <w:lang w:bidi="ar-EG"/>
-              </w:rPr>
-              <w:t xml:space="preserve">   </w:t>
-            </w:r>
-            <w:r>
-              <w:rPr>
-                <w:rFonts w:asciiTheme="majorHAnsi" w:eastAsia="Calibri" w:hAnsiTheme="majorHAnsi" w:cs="Arial" w:hint="cs"/>
-                <w:sz w:val="28"/>
-                <w:szCs w:val="28"/>
-                <w:rtl/>
-                <w:lang w:bidi="ar-EG"/>
-              </w:rPr>
-              <w:t xml:space="preserve"> </w:t>
-            </w:r>
-            <w:r>
-              <w:rPr>
-                <w:rFonts w:asciiTheme="majorHAnsi" w:eastAsia="Calibri" w:hAnsiTheme="majorHAnsi" w:cs="Arial"/>
-                <w:sz w:val="28"/>
-                <w:szCs w:val="28"/>
-                <w:lang w:bidi="ar-EG"/>
-              </w:rPr>
-              <w:t>Shift Time</w:t>
-            </w:r>
-          </w:p>
-        </w:tc>
-        <w:tc>
-          <w:tcPr>
-            <w:tcW w:w="2655" w:type="dxa"/>
-          </w:tcPr>
-          <w:p>
-            <w:pPr>
-              <w:jc w:val="center"/>
-              <w:rPr>
-                <w:rFonts w:asciiTheme="majorHAnsi" w:hAnsiTheme="majorHAnsi"/>
-                <w:sz w:val="32"/>
-                <w:szCs w:val="32"/>
-              </w:rPr>
-            </w:pPr>
-            <w:r>
-              <w:rPr>
-                <w:rFonts w:asciiTheme="majorHAnsi" w:hAnsiTheme="majorHAnsi" w:hint="cs"/>
-                <w:sz w:val="32"/>
-                <w:szCs w:val="32"/>
-                <w:rtl/>
-              </w:rPr>
-              <w:t>صباحي</w:t>
-            </w:r>
           </w:p>
         </w:tc>
       </w:tr>
@@ -1264,7 +1153,6 @@
               </w:rPr>
               <w:t>${</w:t>
             </w:r>
-            <w:proofErr w:type="spellStart"/>
             <w:r>
               <w:rPr>
                 <w:rFonts w:eastAsia="Calibri" w:cs="Arial"/>
@@ -1273,7 +1161,6 @@
               </w:rPr>
               <w:t>row_serial</w:t>
             </w:r>
-            <w:proofErr w:type="spellEnd"/>
             <w:r>
               <w:rPr>
                 <w:rFonts w:eastAsia="Calibri" w:cs="Arial"/>
@@ -1306,7 +1193,6 @@
               </w:rPr>
               <w:t>${</w:t>
             </w:r>
-            <w:proofErr w:type="spellStart"/>
             <w:r>
               <w:rPr>
                 <w:rFonts w:eastAsia="Calibri" w:cs="Arial"/>
@@ -1315,7 +1201,6 @@
               </w:rPr>
               <w:t>row_date</w:t>
             </w:r>
-            <w:proofErr w:type="spellEnd"/>
             <w:r>
               <w:rPr>
                 <w:rFonts w:eastAsia="Calibri" w:cs="Arial"/>
@@ -1443,63 +1328,13 @@
     </w:tbl>
     <w:p/>
     <w:sectPr>
-      <w:pgSz w:w="12240" w:h="15840"/>
-      <w:pgMar w:top="900" w:right="1440" w:bottom="720" w:left="1440" w:header="288" w:footer="720" w:gutter="0"/>
+      <w:pgSz w:w="12240" w:h="15840" w:code="1"/>
+      <w:pgMar w:top="900" w:right="1440" w:bottom="720" w:left="1440" w:header="720" w:footer="720" w:gutter="0"/>
       <w:cols w:space="720"/>
       <w:docGrid w:linePitch="360"/>
     </w:sectPr>
   </w:body>
 </w:document>
-</file>
-
-<file path=word/endnotes.xml><?xml version="1.0" encoding="utf-8"?>
-<w:endnotes xmlns:wpc="http://schemas.microsoft.com/office/word/2010/wordprocessingCanvas" xmlns:cx="http://schemas.microsoft.com/office/drawing/2014/chartex" xmlns:cx1="http://schemas.microsoft.com/office/drawing/2015/9/8/chartex" xmlns:cx2="http://schemas.microsoft.com/office/drawing/2015/10/21/chartex" xmlns:cx3="http://schemas.microsoft.com/office/drawing/2016/5/9/chartex" xmlns:cx4="http://schemas.microsoft.com/office/drawing/2016/5/10/chartex" xmlns:cx5="http://schemas.microsoft.com/office/drawing/2016/5/11/chartex" xmlns:cx6="http://schemas.microsoft.com/office/drawing/2016/5/12/chartex" xmlns:cx7="http://schemas.microsoft.com/office/drawing/2016/5/13/chartex" xmlns:cx8="http://schemas.microsoft.com/office/drawing/2016/5/14/chartex" xmlns:mc="http://schemas.openxmlformats.org/markup-compatibility/2006" xmlns:aink="http://schemas.microsoft.com/office/drawing/2016/ink" xmlns:am3d="http://schemas.microsoft.com/office/drawing/2017/model3d" xmlns:o="urn:schemas-microsoft-com:office:office" xmlns:oel="http://schemas.microsoft.com/office/2019/extlst" xmlns:r="http://schemas.openxmlformats.org/officeDocument/2006/relationships" xmlns:m="http://schemas.openxmlformats.org/officeDocument/2006/math" xmlns:v="urn:schemas-microsoft-com:vml" xmlns:wp14="http://schemas.microsoft.com/office/word/2010/wordprocessingDrawing" xmlns:wp="http://schemas.openxmlformats.org/drawingml/2006/wordprocessingDrawing" xmlns:w10="urn:schemas-microsoft-com:office:word" xmlns:w="http://schemas.openxmlformats.org/wordprocessingml/2006/main" xmlns:w14="http://schemas.microsoft.com/office/word/2010/wordml" xmlns:w15="http://schemas.microsoft.com/office/word/2012/wordml" xmlns:w16cex="http://schemas.microsoft.com/office/word/2018/wordml/cex" xmlns:w16cid="http://schemas.microsoft.com/office/word/2016/wordml/cid" xmlns:w16="http://schemas.microsoft.com/office/word/2018/wordml" xmlns:w16du="http://schemas.microsoft.com/office/word/2023/wordml/word16du" xmlns:w16sdtdh="http://schemas.microsoft.com/office/word/2020/wordml/sdtdatahash" xmlns:w16sdtfl="http://schemas.microsoft.com/office/word/2024/wordml/sdtformatlock" xmlns:w16se="http://schemas.microsoft.com/office/word/2015/wordml/symex" xmlns:wpg="http://schemas.microsoft.com/office/word/2010/wordprocessingGroup" xmlns:wpi="http://schemas.microsoft.com/office/word/2010/wordprocessingInk" xmlns:wne="http://schemas.microsoft.com/office/word/2006/wordml" xmlns:wps="http://schemas.microsoft.com/office/word/2010/wordprocessingShape" mc:Ignorable="w14 w15 w16se w16cid w16 w16cex w16sdtdh w16sdtfl w16du wp14">
-  <w:endnote w:type="separator" w:id="-1">
-    <w:p>
-      <w:pPr>
-        <w:spacing w:after="0" w:line="240" w:lineRule="auto"/>
-      </w:pPr>
-      <w:r>
-        <w:separator/>
-      </w:r>
-    </w:p>
-  </w:endnote>
-  <w:endnote w:type="continuationSeparator" w:id="0">
-    <w:p>
-      <w:pPr>
-        <w:spacing w:after="0" w:line="240" w:lineRule="auto"/>
-      </w:pPr>
-      <w:r>
-        <w:continuationSeparator/>
-      </w:r>
-    </w:p>
-  </w:endnote>
-</w:endnotes>
-</file>
-
-<file path=word/footnotes.xml><?xml version="1.0" encoding="utf-8"?>
-<w:footnotes xmlns:wpc="http://schemas.microsoft.com/office/word/2010/wordprocessingCanvas" xmlns:cx="http://schemas.microsoft.com/office/drawing/2014/chartex" xmlns:cx1="http://schemas.microsoft.com/office/drawing/2015/9/8/chartex" xmlns:cx2="http://schemas.microsoft.com/office/drawing/2015/10/21/chartex" xmlns:cx3="http://schemas.microsoft.com/office/drawing/2016/5/9/chartex" xmlns:cx4="http://schemas.microsoft.com/office/drawing/2016/5/10/chartex" xmlns:cx5="http://schemas.microsoft.com/office/drawing/2016/5/11/chartex" xmlns:cx6="http://schemas.microsoft.com/office/drawing/2016/5/12/chartex" xmlns:cx7="http://schemas.microsoft.com/office/drawing/2016/5/13/chartex" xmlns:cx8="http://schemas.microsoft.com/office/drawing/2016/5/14/chartex" xmlns:mc="http://schemas.openxmlformats.org/markup-compatibility/2006" xmlns:aink="http://schemas.microsoft.com/office/drawing/2016/ink" xmlns:am3d="http://schemas.microsoft.com/office/drawing/2017/model3d" xmlns:o="urn:schemas-microsoft-com:office:office" xmlns:oel="http://schemas.microsoft.com/office/2019/extlst" xmlns:r="http://schemas.openxmlformats.org/officeDocument/2006/relationships" xmlns:m="http://schemas.openxmlformats.org/officeDocument/2006/math" xmlns:v="urn:schemas-microsoft-com:vml" xmlns:wp14="http://schemas.microsoft.com/office/word/2010/wordprocessingDrawing" xmlns:wp="http://schemas.openxmlformats.org/drawingml/2006/wordprocessingDrawing" xmlns:w10="urn:schemas-microsoft-com:office:word" xmlns:w="http://schemas.openxmlformats.org/wordprocessingml/2006/main" xmlns:w14="http://schemas.microsoft.com/office/word/2010/wordml" xmlns:w15="http://schemas.microsoft.com/office/word/2012/wordml" xmlns:w16cex="http://schemas.microsoft.com/office/word/2018/wordml/cex" xmlns:w16cid="http://schemas.microsoft.com/office/word/2016/wordml/cid" xmlns:w16="http://schemas.microsoft.com/office/word/2018/wordml" xmlns:w16du="http://schemas.microsoft.com/office/word/2023/wordml/word16du" xmlns:w16sdtdh="http://schemas.microsoft.com/office/word/2020/wordml/sdtdatahash" xmlns:w16sdtfl="http://schemas.microsoft.com/office/word/2024/wordml/sdtformatlock" xmlns:w16se="http://schemas.microsoft.com/office/word/2015/wordml/symex" xmlns:wpg="http://schemas.microsoft.com/office/word/2010/wordprocessingGroup" xmlns:wpi="http://schemas.microsoft.com/office/word/2010/wordprocessingInk" xmlns:wne="http://schemas.microsoft.com/office/word/2006/wordml" xmlns:wps="http://schemas.microsoft.com/office/word/2010/wordprocessingShape" mc:Ignorable="w14 w15 w16se w16cid w16 w16cex w16sdtdh w16sdtfl w16du wp14">
-  <w:footnote w:type="separator" w:id="-1">
-    <w:p>
-      <w:pPr>
-        <w:spacing w:after="0" w:line="240" w:lineRule="auto"/>
-      </w:pPr>
-      <w:r>
-        <w:separator/>
-      </w:r>
-    </w:p>
-  </w:footnote>
-  <w:footnote w:type="continuationSeparator" w:id="0">
-    <w:p>
-      <w:pPr>
-        <w:spacing w:after="0" w:line="240" w:lineRule="auto"/>
-      </w:pPr>
-      <w:r>
-        <w:continuationSeparator/>
-      </w:r>
-    </w:p>
-  </w:footnote>
-</w:footnotes>
 </file>
 
 <file path=word/styles.xml><?xml version="1.0" encoding="utf-8"?>
@@ -1900,7 +1735,7 @@
   <w:style w:type="paragraph" w:default="1" w:styleId="Normal">
     <w:name w:val="Normal"/>
     <w:qFormat/>
-    <w:rsid w:val="009528CF"/>
+    <w:rsid w:val="00DE562F"/>
     <w:pPr>
       <w:suppressAutoHyphens/>
       <w:bidi/>
@@ -1982,50 +1817,6 @@
       <w:sz w:val="16"/>
       <w:szCs w:val="16"/>
     </w:rPr>
-  </w:style>
-  <w:style w:type="paragraph" w:styleId="Header">
-    <w:name w:val="header"/>
-    <w:basedOn w:val="Normal"/>
-    <w:link w:val="HeaderChar"/>
-    <w:uiPriority w:val="99"/>
-    <w:unhideWhenUsed/>
-    <w:rsid w:val="006F33A8"/>
-    <w:pPr>
-      <w:tabs>
-        <w:tab w:val="center" w:pos="4680"/>
-        <w:tab w:val="right" w:pos="9360"/>
-      </w:tabs>
-      <w:spacing w:after="0" w:line="240" w:lineRule="auto"/>
-    </w:pPr>
-  </w:style>
-  <w:style w:type="character" w:customStyle="1" w:styleId="HeaderChar">
-    <w:name w:val="Header Char"/>
-    <w:basedOn w:val="DefaultParagraphFont"/>
-    <w:link w:val="Header"/>
-    <w:uiPriority w:val="99"/>
-    <w:rsid w:val="006F33A8"/>
-  </w:style>
-  <w:style w:type="paragraph" w:styleId="Footer">
-    <w:name w:val="footer"/>
-    <w:basedOn w:val="Normal"/>
-    <w:link w:val="FooterChar"/>
-    <w:uiPriority w:val="99"/>
-    <w:unhideWhenUsed/>
-    <w:rsid w:val="006F33A8"/>
-    <w:pPr>
-      <w:tabs>
-        <w:tab w:val="center" w:pos="4680"/>
-        <w:tab w:val="right" w:pos="9360"/>
-      </w:tabs>
-      <w:spacing w:after="0" w:line="240" w:lineRule="auto"/>
-    </w:pPr>
-  </w:style>
-  <w:style w:type="character" w:customStyle="1" w:styleId="FooterChar">
-    <w:name w:val="Footer Char"/>
-    <w:basedOn w:val="DefaultParagraphFont"/>
-    <w:link w:val="Footer"/>
-    <w:uiPriority w:val="99"/>
-    <w:rsid w:val="006F33A8"/>
   </w:style>
 </w:styles>
 </file>
@@ -2320,7 +2111,7 @@
 </file>
 
 <file path=customXml/itemProps1.xml><?xml version="1.0" encoding="utf-8"?>
-<ds:datastoreItem xmlns:ds="http://schemas.openxmlformats.org/officeDocument/2006/customXml" ds:itemID="{05F71009-9AF0-4DA7-9D25-6D731EC7FFBA}">
+<ds:datastoreItem xmlns:ds="http://schemas.openxmlformats.org/officeDocument/2006/customXml" ds:itemID="{74C92758-BD4C-4EBD-8C28-0321A979664B}">
   <ds:schemaRefs>
     <ds:schemaRef ds:uri="http://schemas.openxmlformats.org/officeDocument/2006/bibliography"/>
   </ds:schemaRefs>

</xml_diff>